<commit_message>
Say "unpublished" instead of "draft" in the permission wording
状態が4つある以上、真偽値を指す「ドラフト」は実態と合わない。
画面に出る権限の説明文とコードのコメントを「未公開」に統一した。

Co-Authored-By: Claude Opus 5 <noreply@anthropic.com>
</commit_message>
<xml_diff>
--- a/docs/out/公開検証環境_仕様と変更履歴.docx
+++ b/docs/out/公開検証環境_仕様と変更履歴.docx
@@ -2140,7 +2140,7 @@
     </w:p>
     <w:bookmarkEnd w:id="18"/>
     <w:bookmarkEnd w:id="19"/>
-    <w:bookmarkStart w:id="50" w:name="第2部-2回目のデプロイ2026-08-21で入れた変更"/>
+    <w:bookmarkStart w:id="51" w:name="第2部-2回目のデプロイ2026-08-21で入れた変更"/>
     <w:p>
       <w:pPr>
         <w:pStyle w:val="Heading1"/>
@@ -3102,7 +3102,7 @@
               <w:rPr>
                 <w:rFonts w:hint="eastAsia"/>
               </w:rPr>
-              <w:t xml:space="preserve">（無効・ドラフトのデータも見られる）</w:t>
+              <w:t xml:space="preserve">（無効・未公開のデータも見られる）</w:t>
             </w:r>
           </w:p>
         </w:tc>
@@ -3138,7 +3138,7 @@
               <w:rPr>
                 <w:rFonts w:hint="eastAsia"/>
               </w:rPr>
-              <w:t xml:space="preserve">（無効・ドラフトのデータも編集できる）</w:t>
+              <w:t xml:space="preserve">（無効・未公開のデータも編集できる）</w:t>
             </w:r>
           </w:p>
         </w:tc>
@@ -4999,7 +4999,65 @@
               <w:rPr>
                 <w:rFonts w:hint="eastAsia"/>
               </w:rPr>
-              <w:t xml:space="preserve">で状態が4つになり、表示名を「作成中／承認待ち／却下／公開済」に統一した。「ドラフト」は権限の説明文にだけ残っている</w:t>
+              <w:t xml:space="preserve">で状態が4つになり、表示名を「作成中／承認待ち／却下／公開済」に統一した</w:t>
+            </w:r>
+          </w:p>
+        </w:tc>
+      </w:tr>
+      <w:tr>
+        <w:tc>
+          <w:tcPr/>
+          <w:p>
+            <w:pPr>
+              <w:pStyle w:val="Compact"/>
+            </w:pPr>
+            <w:r>
+              <w:t xml:space="preserve">ドラフト</w:t>
+            </w:r>
+          </w:p>
+        </w:tc>
+        <w:tc>
+          <w:tcPr/>
+          <w:p>
+            <w:pPr>
+              <w:pStyle w:val="Compact"/>
+            </w:pPr>
+            <w:r>
+              <w:rPr>
+                <w:rFonts w:hint="eastAsia"/>
+                <w:b/>
+                <w:bCs/>
+              </w:rPr>
+              <w:t xml:space="preserve">未公開</w:t>
+            </w:r>
+          </w:p>
+        </w:tc>
+        <w:tc>
+          <w:tcPr/>
+          <w:p>
+            <w:pPr>
+              <w:pStyle w:val="Compact"/>
+            </w:pPr>
+            <w:r>
+              <w:rPr>
+                <w:rFonts w:hint="eastAsia"/>
+              </w:rPr>
+              <w:t xml:space="preserve">権限の説明文（</w:t>
+            </w:r>
+            <w:r>
+              <w:rPr>
+                <w:rStyle w:val="VerbatimChar"/>
+              </w:rPr>
+              <w:t xml:space="preserve">INACTIVE_VIEW</w:t>
+            </w:r>
+            <w:r>
+              <w:t xml:space="preserve"> </w:t>
+            </w:r>
+            <w:r>
+              <w:rPr>
+                <w:rFonts w:hint="eastAsia"/>
+              </w:rPr>
+              <w:t xml:space="preserve">など）とコードのコメント。状態が4つある以上、真偽値を指す「ドラフト」は使わない</w:t>
             </w:r>
           </w:p>
         </w:tc>
@@ -6169,102 +6227,6 @@
                 <w:rFonts w:hint="eastAsia"/>
               </w:rPr>
               <w:t xml:space="preserve">に届かない）。10章を参照</w:t>
-            </w:r>
-          </w:p>
-        </w:tc>
-      </w:tr>
-      <w:tr>
-        <w:tc>
-          <w:tcPr/>
-          <w:p>
-            <w:pPr>
-              <w:pStyle w:val="Compact"/>
-            </w:pPr>
-            <w:r>
-              <w:rPr>
-                <w:rFonts w:hint="eastAsia"/>
-              </w:rPr>
-              <w:t xml:space="preserve">旧「ドラフト」時代の未使用コード</w:t>
-            </w:r>
-          </w:p>
-        </w:tc>
-        <w:tc>
-          <w:tcPr/>
-          <w:p>
-            <w:pPr>
-              <w:pStyle w:val="Compact"/>
-            </w:pPr>
-            <w:r>
-              <w:rPr>
-                <w:rStyle w:val="VerbatimChar"/>
-              </w:rPr>
-              <w:t xml:space="preserve">draftUpdateSchema</w:t>
-            </w:r>
-            <w:r>
-              <w:t xml:space="preserve"> </w:t>
-            </w:r>
-            <w:r>
-              <w:t xml:space="preserve">と、</w:t>
-            </w:r>
-            <w:r>
-              <w:rPr>
-                <w:rStyle w:val="VerbatimChar"/>
-              </w:rPr>
-              <w:t xml:space="preserve">markDraft</w:t>
-            </w:r>
-            <w:r>
-              <w:t xml:space="preserve"> </w:t>
-            </w:r>
-            <w:r>
-              <w:t xml:space="preserve">/</w:t>
-            </w:r>
-            <w:r>
-              <w:t xml:space="preserve"> </w:t>
-            </w:r>
-            <w:r>
-              <w:rPr>
-                <w:rStyle w:val="VerbatimChar"/>
-              </w:rPr>
-              <w:t xml:space="preserve">draftBadge</w:t>
-            </w:r>
-            <w:r>
-              <w:t xml:space="preserve"> </w:t>
-            </w:r>
-            <w:r>
-              <w:t xml:space="preserve">/</w:t>
-            </w:r>
-            <w:r>
-              <w:t xml:space="preserve"> </w:t>
-            </w:r>
-            <w:r>
-              <w:rPr>
-                <w:rStyle w:val="VerbatimChar"/>
-              </w:rPr>
-              <w:t xml:space="preserve">markDone</w:t>
-            </w:r>
-            <w:r>
-              <w:t xml:space="preserve"> </w:t>
-            </w:r>
-            <w:r>
-              <w:t xml:space="preserve">/</w:t>
-            </w:r>
-            <w:r>
-              <w:t xml:space="preserve"> </w:t>
-            </w:r>
-            <w:r>
-              <w:rPr>
-                <w:rStyle w:val="VerbatimChar"/>
-              </w:rPr>
-              <w:t xml:space="preserve">draftDone</w:t>
-            </w:r>
-            <w:r>
-              <w:t xml:space="preserve"> </w:t>
-            </w:r>
-            <w:r>
-              <w:rPr>
-                <w:rFonts w:hint="eastAsia"/>
-              </w:rPr>
-              <w:t xml:space="preserve">の文言が使われないまま残っている</w:t>
             </w:r>
           </w:p>
         </w:tc>
@@ -8114,7 +8076,7 @@
       </w:r>
     </w:p>
     <w:bookmarkEnd w:id="47"/>
-    <w:bookmarkStart w:id="48" w:name="コミットの一覧2026-08-21-デプロイ済み"/>
+    <w:bookmarkStart w:id="49" w:name="コミットの一覧2026-08-21-デプロイ済み"/>
     <w:p>
       <w:pPr>
         <w:pStyle w:val="Heading2"/>
@@ -8677,8 +8639,216 @@
         <w:t xml:space="preserve">で弾かれていた。</w:t>
       </w:r>
     </w:p>
+    <w:bookmarkStart w:id="48" w:name="デプロイ待ち2026-08-21-時点"/>
+    <w:p>
+      <w:pPr>
+        <w:pStyle w:val="Heading3"/>
+      </w:pPr>
+      <w:r>
+        <w:rPr>
+          <w:rFonts w:hint="eastAsia"/>
+        </w:rPr>
+        <w:t xml:space="preserve">デプロイ待ち（2026-08-21</w:t>
+      </w:r>
+      <w:r>
+        <w:t xml:space="preserve"> </w:t>
+      </w:r>
+      <w:r>
+        <w:rPr>
+          <w:rFonts w:hint="eastAsia"/>
+        </w:rPr>
+        <w:t xml:space="preserve">時点）</w:t>
+      </w:r>
+    </w:p>
+    <w:tbl>
+      <w:tblPr>
+        <w:tblStyle w:val="Table"/>
+        <w:tblW w:type="pct" w:w="5000"/>
+        <w:tblLayout w:type="fixed"/>
+        <w:tblLook w:firstRow="1" w:lastRow="0" w:firstColumn="0" w:lastColumn="0" w:noHBand="0" w:noVBand="0" w:val="0020"/>
+      </w:tblPr>
+      <w:tblGrid>
+        <w:gridCol w:w="3960"/>
+        <w:gridCol w:w="3960"/>
+      </w:tblGrid>
+      <w:tr>
+        <w:trPr>
+          <w:tblHeader w:val="on"/>
+        </w:trPr>
+        <w:tc>
+          <w:tcPr/>
+          <w:p>
+            <w:pPr>
+              <w:pStyle w:val="Compact"/>
+            </w:pPr>
+            <w:r>
+              <w:t xml:space="preserve">コミット</w:t>
+            </w:r>
+          </w:p>
+        </w:tc>
+        <w:tc>
+          <w:tcPr/>
+          <w:p>
+            <w:pPr>
+              <w:pStyle w:val="Compact"/>
+            </w:pPr>
+            <w:r>
+              <w:rPr>
+                <w:rFonts w:hint="eastAsia"/>
+              </w:rPr>
+              <w:t xml:space="preserve">内容</w:t>
+            </w:r>
+          </w:p>
+        </w:tc>
+      </w:tr>
+      <w:tr>
+        <w:tc>
+          <w:tcPr/>
+          <w:p>
+            <w:pPr>
+              <w:pStyle w:val="Compact"/>
+            </w:pPr>
+            <w:r>
+              <w:rPr>
+                <w:rStyle w:val="VerbatimChar"/>
+              </w:rPr>
+              <w:t xml:space="preserve">4fd902f</w:t>
+            </w:r>
+          </w:p>
+        </w:tc>
+        <w:tc>
+          <w:tcPr/>
+          <w:p>
+            <w:pPr>
+              <w:pStyle w:val="Compact"/>
+            </w:pPr>
+            <w:r>
+              <w:rPr>
+                <w:rFonts w:hint="eastAsia"/>
+              </w:rPr>
+              <w:t xml:space="preserve">この資料の追記と</w:t>
+            </w:r>
+            <w:r>
+              <w:t xml:space="preserve"> PDF </w:t>
+            </w:r>
+            <w:r>
+              <w:rPr>
+                <w:rFonts w:hint="eastAsia"/>
+              </w:rPr>
+              <w:t xml:space="preserve">出力</w:t>
+            </w:r>
+          </w:p>
+        </w:tc>
+      </w:tr>
+      <w:tr>
+        <w:tc>
+          <w:tcPr/>
+          <w:p>
+            <w:pPr>
+              <w:pStyle w:val="Compact"/>
+            </w:pPr>
+            <w:r>
+              <w:rPr>
+                <w:rStyle w:val="VerbatimChar"/>
+              </w:rPr>
+              <w:t xml:space="preserve">facf510</w:t>
+            </w:r>
+          </w:p>
+        </w:tc>
+        <w:tc>
+          <w:tcPr/>
+          <w:p>
+            <w:pPr>
+              <w:pStyle w:val="Compact"/>
+            </w:pPr>
+            <w:r>
+              <w:rPr>
+                <w:rFonts w:hint="eastAsia"/>
+              </w:rPr>
+              <w:t xml:space="preserve">旧ドラフト時代の未使用の文言とスキーマを削除。一括操作の指定を</w:t>
+            </w:r>
+            <w:r>
+              <w:t xml:space="preserve"> </w:t>
+            </w:r>
+            <w:r>
+              <w:rPr>
+                <w:rStyle w:val="VerbatimChar"/>
+              </w:rPr>
+              <w:t xml:space="preserve">bulkAction</w:t>
+            </w:r>
+            <w:r>
+              <w:t xml:space="preserve"> </w:t>
+            </w:r>
+            <w:r>
+              <w:t xml:space="preserve">にまとめた</w:t>
+            </w:r>
+          </w:p>
+        </w:tc>
+      </w:tr>
+      <w:tr>
+        <w:tc>
+          <w:tcPr/>
+          <w:p>
+            <w:pPr>
+              <w:pStyle w:val="Compact"/>
+            </w:pPr>
+            <w:r>
+              <w:rPr>
+                <w:rStyle w:val="VerbatimChar"/>
+              </w:rPr>
+              <w:t xml:space="preserve">180daf9</w:t>
+            </w:r>
+          </w:p>
+        </w:tc>
+        <w:tc>
+          <w:tcPr/>
+          <w:p>
+            <w:pPr>
+              <w:pStyle w:val="Compact"/>
+            </w:pPr>
+            <w:r>
+              <w:rPr>
+                <w:rFonts w:hint="eastAsia"/>
+              </w:rPr>
+              <w:t xml:space="preserve">権限をコマンドから付けるスクリプトを追加</w:t>
+            </w:r>
+          </w:p>
+        </w:tc>
+      </w:tr>
+      <w:tr>
+        <w:tc>
+          <w:tcPr/>
+          <w:p>
+            <w:pPr>
+              <w:pStyle w:val="Compact"/>
+            </w:pPr>
+            <w:r>
+              <w:rPr>
+                <w:rFonts w:hint="eastAsia"/>
+              </w:rPr>
+              <w:t xml:space="preserve">（次）</w:t>
+            </w:r>
+          </w:p>
+        </w:tc>
+        <w:tc>
+          <w:tcPr/>
+          <w:p>
+            <w:pPr>
+              <w:pStyle w:val="Compact"/>
+            </w:pPr>
+            <w:r>
+              <w:rPr>
+                <w:rFonts w:hint="eastAsia"/>
+              </w:rPr>
+              <w:t xml:space="preserve">権限の説明文の「ドラフト」を「未公開」に</w:t>
+            </w:r>
+          </w:p>
+        </w:tc>
+      </w:tr>
+    </w:tbl>
     <w:bookmarkEnd w:id="48"/>
-    <w:bookmarkStart w:id="49" w:name="デプロイ後にすること"/>
+    <w:bookmarkEnd w:id="49"/>
+    <w:bookmarkStart w:id="50" w:name="デプロイ後にすること"/>
     <w:p>
       <w:pPr>
         <w:pStyle w:val="Heading2"/>
@@ -8857,8 +9027,8 @@
         <w:t xml:space="preserve">要らないなら「発行」の操作が必要になる。</w:t>
       </w:r>
     </w:p>
-    <w:bookmarkEnd w:id="49"/>
     <w:bookmarkEnd w:id="50"/>
+    <w:bookmarkEnd w:id="51"/>
     <w:sectPr>
       <w:footnotePr>
         <w:numRestart w:val="eachSect"/>

</xml_diff>